<commit_message>
Finished Chapter 4 Homework
</commit_message>
<xml_diff>
--- a/HTML_CSS/Homework/HTML_CH04_HW/HTML_CH04_HW.docx
+++ b/HTML_CSS/Homework/HTML_CH04_HW/HTML_CH04_HW.docx
@@ -124,10 +124,7 @@
         <w:ind w:left="-5"/>
       </w:pPr>
       <w:r>
-        <w:t>Create a web page about your favorite hobby and use an external style sheet to implement</w:t>
-      </w:r>
-      <w:r>
-        <w:t xml:space="preserve"> #2.</w:t>
+        <w:t>Create a web page about your favorite hobby and use an external style sheet to implement #2.</w:t>
       </w:r>
     </w:p>
     <w:p>
@@ -155,14 +152,21 @@
         <w:tabs>
           <w:tab w:val="num" w:pos="720"/>
         </w:tabs>
-      </w:pPr>
-      <w:r>
+        <w:rPr>
+          <w:strike/>
+        </w:rPr>
+      </w:pPr>
+      <w:r>
+        <w:rPr>
+          <w:strike/>
+        </w:rPr>
         <w:t xml:space="preserve">index.html file created – </w:t>
       </w:r>
       <w:r>
         <w:rPr>
           <w:b/>
           <w:bCs/>
+          <w:strike/>
         </w:rPr>
         <w:t>5 pts</w:t>
       </w:r>
@@ -176,14 +180,21 @@
         <w:tabs>
           <w:tab w:val="num" w:pos="720"/>
         </w:tabs>
-      </w:pPr>
-      <w:r>
+        <w:rPr>
+          <w:strike/>
+        </w:rPr>
+      </w:pPr>
+      <w:r>
+        <w:rPr>
+          <w:strike/>
+        </w:rPr>
         <w:t xml:space="preserve">Wrapper div centered with margins – </w:t>
       </w:r>
       <w:r>
         <w:rPr>
           <w:b/>
           <w:bCs/>
+          <w:strike/>
         </w:rPr>
         <w:t>5 pts</w:t>
       </w:r>
@@ -197,14 +208,21 @@
         <w:tabs>
           <w:tab w:val="num" w:pos="720"/>
         </w:tabs>
-      </w:pPr>
-      <w:r>
+        <w:rPr>
+          <w:strike/>
+        </w:rPr>
+      </w:pPr>
+      <w:r>
+        <w:rPr>
+          <w:strike/>
+        </w:rPr>
         <w:t xml:space="preserve">Semantic structure (header, nav, main, footer) – </w:t>
       </w:r>
       <w:r>
         <w:rPr>
           <w:b/>
           <w:bCs/>
+          <w:strike/>
         </w:rPr>
         <w:t>5 pts</w:t>
       </w:r>
@@ -212,6 +230,9 @@
     <w:p>
       <w:pPr>
         <w:ind w:left="720" w:firstLine="0"/>
+        <w:rPr>
+          <w:strike/>
+        </w:rPr>
       </w:pPr>
     </w:p>
     <w:p>
@@ -233,18 +254,28 @@
     <w:p>
       <w:pPr>
         <w:ind w:left="1440" w:firstLine="0"/>
-      </w:pPr>
-      <w:r>
+        <w:rPr>
+          <w:strike/>
+        </w:rPr>
+      </w:pPr>
+      <w:r>
+        <w:rPr>
+          <w:strike/>
+        </w:rPr>
         <w:t xml:space="preserve">a. Inline element (with HTML comment) – </w:t>
       </w:r>
       <w:r>
         <w:rPr>
           <w:b/>
           <w:bCs/>
+          <w:strike/>
         </w:rPr>
         <w:t>2.5 pts</w:t>
       </w:r>
       <w:r>
+        <w:rPr>
+          <w:strike/>
+        </w:rPr>
         <w:br/>
         <w:t xml:space="preserve">b. Block element (with HTML comment) – </w:t>
       </w:r>
@@ -252,48 +283,72 @@
         <w:rPr>
           <w:b/>
           <w:bCs/>
+          <w:strike/>
         </w:rPr>
         <w:t>2.5 pts</w:t>
       </w:r>
       <w:r>
+        <w:rPr>
+          <w:strike/>
+        </w:rPr>
         <w:br/>
         <w:t>c. Relative measurement (</w:t>
       </w:r>
       <w:proofErr w:type="spellStart"/>
       <w:r>
+        <w:rPr>
+          <w:strike/>
+        </w:rPr>
         <w:t>em</w:t>
       </w:r>
       <w:proofErr w:type="spellEnd"/>
       <w:r>
+        <w:rPr>
+          <w:strike/>
+        </w:rPr>
         <w:t xml:space="preserve"> or %) – </w:t>
       </w:r>
       <w:r>
         <w:rPr>
           <w:b/>
           <w:bCs/>
+          <w:strike/>
         </w:rPr>
         <w:t>2.5 pts</w:t>
       </w:r>
       <w:r>
+        <w:rPr>
+          <w:strike/>
+        </w:rPr>
         <w:br/>
         <w:t>d. Absolute measurement (</w:t>
       </w:r>
       <w:proofErr w:type="spellStart"/>
       <w:r>
+        <w:rPr>
+          <w:strike/>
+        </w:rPr>
         <w:t>px</w:t>
       </w:r>
       <w:proofErr w:type="spellEnd"/>
       <w:r>
+        <w:rPr>
+          <w:strike/>
+        </w:rPr>
         <w:t xml:space="preserve"> or pt) – </w:t>
       </w:r>
       <w:r>
         <w:rPr>
           <w:b/>
           <w:bCs/>
+          <w:strike/>
         </w:rPr>
         <w:t>2.5 pts</w:t>
       </w:r>
       <w:r>
+        <w:rPr>
+          <w:strike/>
+        </w:rPr>
         <w:br/>
         <w:t xml:space="preserve">e. Hex color value – </w:t>
       </w:r>
@@ -301,10 +356,14 @@
         <w:rPr>
           <w:b/>
           <w:bCs/>
+          <w:strike/>
         </w:rPr>
         <w:t>2.5 pts</w:t>
       </w:r>
       <w:r>
+        <w:rPr>
+          <w:strike/>
+        </w:rPr>
         <w:br/>
         <w:t xml:space="preserve">f. RGB color value – </w:t>
       </w:r>
@@ -312,10 +371,14 @@
         <w:rPr>
           <w:b/>
           <w:bCs/>
+          <w:strike/>
         </w:rPr>
         <w:t>2.5 pts</w:t>
       </w:r>
       <w:r>
+        <w:rPr>
+          <w:strike/>
+        </w:rPr>
         <w:br/>
         <w:t xml:space="preserve">g. RGBA color value – </w:t>
       </w:r>
@@ -323,10 +386,14 @@
         <w:rPr>
           <w:b/>
           <w:bCs/>
+          <w:strike/>
         </w:rPr>
         <w:t>2.5 pts</w:t>
       </w:r>
       <w:r>
+        <w:rPr>
+          <w:strike/>
+        </w:rPr>
         <w:br/>
         <w:t xml:space="preserve">h. Descendant selector – </w:t>
       </w:r>
@@ -334,28 +401,42 @@
         <w:rPr>
           <w:b/>
           <w:bCs/>
+          <w:strike/>
         </w:rPr>
         <w:t>5 pts</w:t>
       </w:r>
       <w:r>
+        <w:rPr>
+          <w:strike/>
+        </w:rPr>
         <w:br/>
       </w:r>
       <w:proofErr w:type="spellStart"/>
       <w:r>
+        <w:rPr>
+          <w:strike/>
+        </w:rPr>
         <w:t>i</w:t>
       </w:r>
       <w:proofErr w:type="spellEnd"/>
       <w:r>
+        <w:rPr>
+          <w:strike/>
+        </w:rPr>
         <w:t xml:space="preserve">. Multiple selectors – </w:t>
       </w:r>
       <w:r>
         <w:rPr>
           <w:b/>
           <w:bCs/>
+          <w:strike/>
         </w:rPr>
         <w:t>5 pts</w:t>
       </w:r>
       <w:r>
+        <w:rPr>
+          <w:strike/>
+        </w:rPr>
         <w:br/>
         <w:t xml:space="preserve">j. Child selector – </w:t>
       </w:r>
@@ -363,10 +444,14 @@
         <w:rPr>
           <w:b/>
           <w:bCs/>
+          <w:strike/>
         </w:rPr>
         <w:t>5 pts</w:t>
       </w:r>
       <w:r>
+        <w:rPr>
+          <w:strike/>
+        </w:rPr>
         <w:br/>
         <w:t xml:space="preserve">k. Padding and margin – </w:t>
       </w:r>
@@ -374,32 +459,48 @@
         <w:rPr>
           <w:b/>
           <w:bCs/>
+          <w:strike/>
         </w:rPr>
         <w:t>5 pts</w:t>
       </w:r>
       <w:r>
         <w:br/>
+      </w:r>
+      <w:r>
+        <w:rPr>
+          <w:strike/>
+        </w:rPr>
         <w:t xml:space="preserve">l. Pseudo-class selector (:hover and :focus) – </w:t>
       </w:r>
       <w:r>
         <w:rPr>
           <w:b/>
           <w:bCs/>
+          <w:strike/>
         </w:rPr>
         <w:t>5 pts</w:t>
       </w:r>
       <w:r>
         <w:br/>
+      </w:r>
+      <w:r>
+        <w:rPr>
+          <w:strike/>
+        </w:rPr>
         <w:t xml:space="preserve">m. Shorthand font property (family, size, style, weight, line height) – </w:t>
       </w:r>
       <w:r>
         <w:rPr>
           <w:b/>
           <w:bCs/>
+          <w:strike/>
         </w:rPr>
         <w:t>5 pts</w:t>
       </w:r>
       <w:r>
+        <w:rPr>
+          <w:strike/>
+        </w:rPr>
         <w:br/>
         <w:t xml:space="preserve">n. Font shadow – </w:t>
       </w:r>
@@ -407,6 +508,7 @@
         <w:rPr>
           <w:b/>
           <w:bCs/>
+          <w:strike/>
         </w:rPr>
         <w:t>5 pts</w:t>
       </w:r>
@@ -429,7 +531,37 @@
           <w:b/>
           <w:bCs/>
         </w:rPr>
-        <w:t>3. CSS Cascade Demonstration (inline + embedded + external CSS) – 10 pts</w:t>
+        <w:t>3. CSS Cascade Demonstration (</w:t>
+      </w:r>
+      <w:r>
+        <w:rPr>
+          <w:b/>
+          <w:bCs/>
+          <w:strike/>
+        </w:rPr>
+        <w:t>inline +</w:t>
+      </w:r>
+      <w:r>
+        <w:rPr>
+          <w:b/>
+          <w:bCs/>
+        </w:rPr>
+        <w:t xml:space="preserve"> </w:t>
+      </w:r>
+      <w:r>
+        <w:rPr>
+          <w:b/>
+          <w:bCs/>
+          <w:strike/>
+        </w:rPr>
+        <w:t>embedded + external CSS</w:t>
+      </w:r>
+      <w:r>
+        <w:rPr>
+          <w:b/>
+          <w:bCs/>
+        </w:rPr>
+        <w:t>) – 10 pts</w:t>
       </w:r>
     </w:p>
     <w:p>
@@ -461,28 +593,42 @@
     <w:p>
       <w:pPr>
         <w:ind w:left="1440" w:firstLine="0"/>
-      </w:pPr>
-      <w:r>
+        <w:rPr>
+          <w:strike/>
+        </w:rPr>
+      </w:pPr>
+      <w:r>
+        <w:rPr>
+          <w:strike/>
+        </w:rPr>
         <w:t xml:space="preserve">a. Integrate </w:t>
       </w:r>
       <w:r>
         <w:rPr>
           <w:b/>
           <w:bCs/>
+          <w:strike/>
         </w:rPr>
         <w:t>normalize.css</w:t>
       </w:r>
       <w:r>
+        <w:rPr>
+          <w:strike/>
+        </w:rPr>
         <w:t xml:space="preserve"> – </w:t>
       </w:r>
       <w:r>
         <w:rPr>
           <w:b/>
           <w:bCs/>
+          <w:strike/>
         </w:rPr>
         <w:t>5 pts</w:t>
       </w:r>
       <w:r>
+        <w:rPr>
+          <w:strike/>
+        </w:rPr>
         <w:br/>
         <w:t xml:space="preserve">b. Custom margin &amp; padding on 5+ elements – </w:t>
       </w:r>
@@ -490,11 +636,17 @@
         <w:rPr>
           <w:b/>
           <w:bCs/>
+          <w:strike/>
         </w:rPr>
         <w:t>5 pts</w:t>
       </w:r>
       <w:r>
         <w:br/>
+      </w:r>
+      <w:r>
+        <w:rPr>
+          <w:strike/>
+        </w:rPr>
         <w:t>c. Add border to headings:</w:t>
       </w:r>
     </w:p>
@@ -507,14 +659,21 @@
         <w:tabs>
           <w:tab w:val="num" w:pos="720"/>
         </w:tabs>
-      </w:pPr>
-      <w:r>
+        <w:rPr>
+          <w:strike/>
+        </w:rPr>
+      </w:pPr>
+      <w:r>
+        <w:rPr>
+          <w:strike/>
+        </w:rPr>
         <w:t xml:space="preserve">10px – </w:t>
       </w:r>
       <w:r>
         <w:rPr>
           <w:b/>
           <w:bCs/>
+          <w:strike/>
         </w:rPr>
         <w:t>1.5 pts</w:t>
       </w:r>
@@ -528,14 +687,21 @@
         <w:tabs>
           <w:tab w:val="num" w:pos="720"/>
         </w:tabs>
-      </w:pPr>
-      <w:r>
+        <w:rPr>
+          <w:strike/>
+        </w:rPr>
+      </w:pPr>
+      <w:r>
+        <w:rPr>
+          <w:strike/>
+        </w:rPr>
         <w:t xml:space="preserve">Dashed – </w:t>
       </w:r>
       <w:r>
         <w:rPr>
           <w:b/>
           <w:bCs/>
+          <w:strike/>
         </w:rPr>
         <w:t>1.5 pts</w:t>
       </w:r>
@@ -551,16 +717,23 @@
         </w:tabs>
       </w:pPr>
       <w:r>
+        <w:rPr>
+          <w:strike/>
+        </w:rPr>
         <w:t xml:space="preserve">Custom color – </w:t>
       </w:r>
       <w:r>
         <w:rPr>
           <w:b/>
           <w:bCs/>
+          <w:strike/>
         </w:rPr>
         <w:t>2 pts</w:t>
       </w:r>
       <w:r>
+        <w:rPr>
+          <w:strike/>
+        </w:rPr>
         <w:br/>
       </w:r>
       <w:r>
@@ -585,6 +758,9 @@
         <w:ind w:left="1440" w:firstLine="0"/>
       </w:pPr>
       <w:r>
+        <w:rPr>
+          <w:strike/>
+        </w:rPr>
         <w:lastRenderedPageBreak/>
         <w:t xml:space="preserve">d. Gradient background on header – </w:t>
       </w:r>
@@ -592,10 +768,14 @@
         <w:rPr>
           <w:b/>
           <w:bCs/>
+          <w:strike/>
         </w:rPr>
         <w:t>2.5 pts</w:t>
       </w:r>
       <w:r>
+        <w:rPr>
+          <w:strike/>
+        </w:rPr>
         <w:br/>
         <w:t xml:space="preserve">e. Gradient background on body – </w:t>
       </w:r>
@@ -603,17 +783,27 @@
         <w:rPr>
           <w:b/>
           <w:bCs/>
+          <w:strike/>
         </w:rPr>
         <w:t>2.5 pts</w:t>
       </w:r>
       <w:r>
+        <w:rPr>
+          <w:strike/>
+        </w:rPr>
         <w:br/>
+      </w:r>
+      <w:r>
+        <w:rPr>
+          <w:strike/>
+        </w:rPr>
         <w:t xml:space="preserve">f. Custom heights &amp; widths for paragraphs – </w:t>
       </w:r>
       <w:r>
         <w:rPr>
           <w:b/>
           <w:bCs/>
+          <w:strike/>
         </w:rPr>
         <w:t>5 pts</w:t>
       </w:r>
@@ -660,7 +850,21 @@
             <w:color w:val="0000FF"/>
             <w:u w:val="single" w:color="0000FF"/>
           </w:rPr>
-          <w:t>https://validator.w3.org/</w:t>
+          <w:t>https://validato</w:t>
+        </w:r>
+        <w:r>
+          <w:rPr>
+            <w:color w:val="0000FF"/>
+            <w:u w:val="single" w:color="0000FF"/>
+          </w:rPr>
+          <w:t>r</w:t>
+        </w:r>
+        <w:r>
+          <w:rPr>
+            <w:color w:val="0000FF"/>
+            <w:u w:val="single" w:color="0000FF"/>
+          </w:rPr>
+          <w:t>.w3.org/</w:t>
         </w:r>
       </w:hyperlink>
     </w:p>
@@ -1659,6 +1863,7 @@
   <w:style w:type="character" w:default="1" w:styleId="DefaultParagraphFont">
     <w:name w:val="Default Paragraph Font"/>
     <w:uiPriority w:val="1"/>
+    <w:semiHidden/>
     <w:unhideWhenUsed/>
   </w:style>
   <w:style w:type="table" w:default="1" w:styleId="TableNormal">

</xml_diff>